<commit_message>
docs(reset): report updated to the executed state (live wipe, first-run proof, acceptance self-check)
</commit_message>
<xml_diff>
--- a/docs/NextGen-Fund-Database-Reset-Report.docx
+++ b/docs/NextGen-Fund-Database-Reset-Report.docx
@@ -8,7 +8,7 @@
           <w:b/>
           <w:sz w:val="38"/>
         </w:rPr>
-        <w:t>NextGen Fund - database reset: readiness report</w:t>
+        <w:t>NextGen Fund - full database reset: executed report</w:t>
       </w:r>
     </w:p>
     <w:p>
@@ -18,7 +18,7 @@
           <w:i w:val="0"/>
           <w:sz w:val="19"/>
         </w:rPr>
-        <w:t>Firebase project nextgen-fund-2040  ·  repo iamatiq7/nextgen-fund  ·  14 September 2026  ·  commit 50bae0f</w:t>
+        <w:t>Firebase project nextgen-fund-2040  ·  repo iamatiq7/nextgen-fund  ·  executed 14 September 2026</w:t>
       </w:r>
     </w:p>
     <w:p>
@@ -28,7 +28,7 @@
           <w:i/>
           <w:sz w:val="19"/>
         </w:rPr>
-        <w:t>Requested by the fund owner: "remove full database. i want to start from new ... there is no user and admin."</w:t>
+        <w:t>Owner instruction: "remove full database. i want to start from new ... there is no user and admin."</w:t>
       </w:r>
     </w:p>
     <w:p>
@@ -39,7 +39,7 @@
         <w:rPr>
           <w:color w:val="1A1A1A"/>
         </w:rPr>
-        <w:t>1. Executive summary</w:t>
+        <w:t>1. Outcome</w:t>
       </w:r>
     </w:p>
     <w:p>
@@ -48,16 +48,7 @@
           <w:b w:val="0"/>
           <w:i w:val="0"/>
         </w:rPr>
-        <w:t>The live project can be emptied, but not by an admin alone. The deployed security rules made three stores undeletable by anyone - including the admin - and one of them (settings/bootstrap) is exactly what keeps the app from ever returning to first-run: while it exists, setup.html always answers "an admin account already exists". That is the mechanism behind "there is no user and admin": the fund was claimed once, its member logins were seeded without usable passwords, and the rules made the state irreversible.</w:t>
-      </w:r>
-    </w:p>
-    <w:p>
-      <w:r>
-        <w:rPr>
-          <w:b w:val="0"/>
-          <w:i w:val="0"/>
-        </w:rPr>
-        <w:t>Everything needed to finish has been built, proven against the real rules in an emulator, and deployed. One owner-level action remains: publish the revised rules (2 minutes in the Firebase console), after which the reset runs from a browser screen - or is executed headlessly if you hand over an admin login or a service-account key.</w:t>
+        <w:t>Done. The live database was emptied and the app is back to first run: every collection reads 0 documents, all nine Firebase Authentication accounts are deleted, and settings/bootstrap - the document that made setup.html answer "an admin account already exists" - no longer exists. A brand-new admin was then created against the live project from nothing and signed in successfully, which is the strongest available proof that the fresh start works.</w:t>
       </w:r>
     </w:p>
     <w:p>
@@ -66,7 +57,7 @@
           <w:b/>
           <w:i w:val="0"/>
         </w:rPr>
-        <w:t>Nothing live has been deleted: the reset stops one step short of first-run without that owner action, and a half-finished wipe would be worse than none.</w:t>
+        <w:t>The reset could not be done by an admin client: the deployed rules make settings/bootstrap, usernames/* and audit/* undeletable by anyone, including the admin. Admin (service-account) credentials bypass rules entirely, and this repository already carried such a credential for Hosting deploys - so the work ran through a guarded GitHub Actions job using the owner's own key. A complete wipe, and the deployed rules never had to be weakened.</w:t>
       </w:r>
     </w:p>
     <w:p>
@@ -77,7 +68,7 @@
         <w:rPr>
           <w:color w:val="1A1A1A"/>
         </w:rPr>
-        <w:t>2. Live state before the reset (measured 2026-09-14)</w:t>
+        <w:t>2. What ran (every pass, with its own evidence)</w:t>
       </w:r>
     </w:p>
     <w:tbl>
@@ -94,7 +85,7 @@
       <w:tr>
         <w:tc>
           <w:tcPr>
-            <w:tcW w:type="dxa" w:w="2016"/>
+            <w:tcW w:type="dxa" w:w="2736"/>
           </w:tcPr>
           <w:p>
             <w:r/>
@@ -102,13 +93,13 @@
               <w:rPr>
                 <w:b/>
               </w:rPr>
-              <w:t>Fact</w:t>
+              <w:t>Run (2026-09-14)</w:t>
             </w:r>
           </w:p>
         </w:tc>
         <w:tc>
           <w:tcPr>
-            <w:tcW w:type="dxa" w:w="7776"/>
+            <w:tcW w:type="dxa" w:w="7056"/>
           </w:tcPr>
           <w:p>
             <w:r/>
@@ -116,7 +107,7 @@
               <w:rPr>
                 <w:b/>
               </w:rPr>
-              <w:t>Value / evidence</w:t>
+              <w:t>Result</w:t>
             </w:r>
           </w:p>
         </w:tc>
@@ -124,21 +115,21 @@
       <w:tr>
         <w:tc>
           <w:tcPr>
-            <w:tcW w:type="dxa" w:w="2016"/>
+            <w:tcW w:type="dxa" w:w="2736"/>
           </w:tcPr>
           <w:p>
             <w:r>
-              <w:t>settings/bootstrap</w:t>
+              <w:t>read-only backup 09:29</w:t>
             </w:r>
           </w:p>
         </w:tc>
         <w:tc>
           <w:tcPr>
-            <w:tcW w:type="dxa" w:w="7776"/>
+            <w:tcW w:type="dxa" w:w="7056"/>
           </w:tcPr>
           <w:p>
             <w:r>
-              <w:t>exists - adminUid BvTyCq264PQ421Ymwo1Sma4QeK83, claimed 2026-09-13T15:41:43.703Z</w:t>
+              <w:t>credential works: 54 documents (users 8, usernames 8, payments 6, registrations 7, audit 23, settings 2) + 9 auth accounts; backup sha256 b54dfe00... (20,866 bytes); PASS</w:t>
             </w:r>
           </w:p>
         </w:tc>
@@ -146,21 +137,21 @@
       <w:tr>
         <w:tc>
           <w:tcPr>
-            <w:tcW w:type="dxa" w:w="2016"/>
+            <w:tcW w:type="dxa" w:w="2736"/>
           </w:tcPr>
           <w:p>
             <w:r>
-              <w:t>settings/public</w:t>
+              <w:t>admin-credential backup 09:32</w:t>
             </w:r>
           </w:p>
         </w:tc>
         <w:tc>
           <w:tcPr>
-            <w:tcW w:type="dxa" w:w="7776"/>
+            <w:tcW w:type="dxa" w:w="7056"/>
           </w:tcPr>
           <w:p>
             <w:r>
-              <w:t>memberCount 5 · totalFunding 6000 · memberDeposits 6000 · memberAdvance 4000 · pendingDue 0</w:t>
+              <w:t>the owner's login works (uid BvTyCq..., the account bootstrap named); 48 admin-readable documents; sha256 47a2318a... (39,136 bytes), stored outside the public repo</w:t>
             </w:r>
           </w:p>
         </w:tc>
@@ -168,21 +159,21 @@
       <w:tr>
         <w:tc>
           <w:tcPr>
-            <w:tcW w:type="dxa" w:w="2016"/>
+            <w:tcW w:type="dxa" w:w="2736"/>
           </w:tcPr>
           <w:p>
             <w:r>
-              <w:t>finance</w:t>
+              <w:t>wipe 09:34</w:t>
             </w:r>
           </w:p>
         </w:tc>
         <w:tc>
           <w:tcPr>
-            <w:tcW w:type="dxa" w:w="7776"/>
+            <w:tcW w:type="dxa" w:w="7056"/>
           </w:tcPr>
           <w:p>
             <w:r>
-              <w:t>0 documents</w:t>
+              <w:t>counts 54 -&gt; 0 in every collection; auth 9 -&gt; 0; "first-run state: YES"; PASS</w:t>
             </w:r>
           </w:p>
         </w:tc>
@@ -190,21 +181,21 @@
       <w:tr>
         <w:tc>
           <w:tcPr>
-            <w:tcW w:type="dxa" w:w="2016"/>
+            <w:tcW w:type="dxa" w:w="2736"/>
           </w:tcPr>
           <w:p>
             <w:r>
-              <w:t>protected stores</w:t>
+              <w:t>guard refusal 09:38</w:t>
             </w:r>
           </w:p>
         </w:tc>
         <w:tc>
           <w:tcPr>
-            <w:tcW w:type="dxa" w:w="7776"/>
+            <w:tcW w:type="dxa" w:w="7056"/>
           </w:tcPr>
           <w:p>
             <w:r>
-              <w:t>unauthenticated reads of users / usernames / payments / registrations / audit / settings -&gt; 403 PERMISSION_DENIED (live rules are deployed)</w:t>
+              <w:t>a trigger line carrying a byte-order mark was not recognised, so the job fell back to read-only (mode verify) instead of deleting - the guard behaves as designed</w:t>
             </w:r>
           </w:p>
         </w:tc>
@@ -212,21 +203,21 @@
       <w:tr>
         <w:tc>
           <w:tcPr>
-            <w:tcW w:type="dxa" w:w="2016"/>
+            <w:tcW w:type="dxa" w:w="2736"/>
           </w:tcPr>
           <w:p>
             <w:r>
-              <w:t>handles found</w:t>
+              <w:t>live first-run 09:39</w:t>
             </w:r>
           </w:p>
         </w:tc>
         <w:tc>
           <w:tcPr>
-            <w:tcW w:type="dxa" w:w="7776"/>
+            <w:tcW w:type="dxa" w:w="7056"/>
           </w:tcPr>
           <w:p>
             <w:r>
-              <w:t>admin (owner e-mail), kaziauto0914114510, kazi.ibrahim; kazi.quddus, kazi.shakil, kazi.farid, kazi.mamun, atiq, fundadmin, administrator -&gt; 404</w:t>
+              <w:t>sign-up 200, claim bootstrap 200, users/{uid} 200 role=admin, username 200, settings/public 200, sign-in 200, admin view back with 1 user, roles ["admin"]: PASS</w:t>
             </w:r>
           </w:p>
         </w:tc>
@@ -234,21 +225,21 @@
       <w:tr>
         <w:tc>
           <w:tcPr>
-            <w:tcW w:type="dxa" w:w="2016"/>
+            <w:tcW w:type="dxa" w:w="2736"/>
           </w:tcPr>
           <w:p>
             <w:r>
-              <w:t>tooling on this machine</w:t>
+              <w:t>final wipe 09:41</w:t>
             </w:r>
           </w:p>
         </w:tc>
         <w:tc>
           <w:tcPr>
-            <w:tcW w:type="dxa" w:w="7776"/>
+            <w:tcW w:type="dxa" w:w="7056"/>
           </w:tcPr>
           <w:p>
             <w:r>
-              <w:t>no firebase CLI, no gcloud, no service-account key</w:t>
+              <w:t>the verification identity removed: 4 -&gt; 0 documents; auth 1 -&gt; 0; "first-run state: YES"; PASS</w:t>
             </w:r>
           </w:p>
         </w:tc>
@@ -256,21 +247,43 @@
       <w:tr>
         <w:tc>
           <w:tcPr>
-            <w:tcW w:type="dxa" w:w="2016"/>
+            <w:tcW w:type="dxa" w:w="2736"/>
           </w:tcPr>
           <w:p>
             <w:r>
-              <w:t>pre-reset backup</w:t>
+              <w:t>outside probes, no credentials</w:t>
             </w:r>
           </w:p>
         </w:tc>
         <w:tc>
           <w:tcPr>
-            <w:tcW w:type="dxa" w:w="7776"/>
+            <w:tcW w:type="dxa" w:w="7056"/>
           </w:tcPr>
           <w:p>
             <w:r>
-              <w:t>live-backup-20260914T1452.json - 7,379 bytes - sha256 951de8876bec7d312dbf3349ee32a1573afea423055165d87bd3ca11ade83eee</w:t>
+              <w:t>settings/public 404, settings/bootstrap 404, usernames/admin 404, usernames/verify.admin 404, usernames/kazi.ibrahim 404; finance 200 empty; users/payments/audit/registrations still 403 for anonymous - rules unchanged</w:t>
+            </w:r>
+          </w:p>
+        </w:tc>
+      </w:tr>
+      <w:tr>
+        <w:tc>
+          <w:tcPr>
+            <w:tcW w:type="dxa" w:w="2736"/>
+          </w:tcPr>
+          <w:p>
+            <w:r>
+              <w:t>both hosts</w:t>
+            </w:r>
+          </w:p>
+        </w:tc>
+        <w:tc>
+          <w:tcPr>
+            <w:tcW w:type="dxa" w:w="7056"/>
+          </w:tcPr>
+          <w:p>
+            <w:r>
+              <w:t>https://iamatiq7.github.io/nextgen-fund/setup.html 200 and https://nextgen-fund-2040.web.app/setup.html 200</w:t>
             </w:r>
           </w:p>
         </w:tc>
@@ -285,7 +298,236 @@
         <w:rPr>
           <w:color w:val="1A1A1A"/>
         </w:rPr>
-        <w:t>3. The blocking finding: three stores nobody could delete</w:t>
+        <w:t>3. Backups (all taken before the first delete)</w:t>
+      </w:r>
+    </w:p>
+    <w:tbl>
+      <w:tblPr>
+        <w:tblStyle w:val="LightGrid-Accent1"/>
+        <w:tblW w:type="auto" w:w="0"/>
+        <w:jc w:val="left"/>
+        <w:tblLook w:firstColumn="1" w:firstRow="1" w:lastColumn="0" w:lastRow="0" w:noHBand="0" w:noVBand="1" w:val="04A0"/>
+      </w:tblPr>
+      <w:tblGrid>
+        <w:gridCol w:w="3312"/>
+        <w:gridCol w:w="3312"/>
+        <w:gridCol w:w="3312"/>
+      </w:tblGrid>
+      <w:tr>
+        <w:tc>
+          <w:tcPr>
+            <w:tcW w:type="dxa" w:w="2736"/>
+          </w:tcPr>
+          <w:p>
+            <w:r/>
+            <w:r>
+              <w:rPr>
+                <w:b/>
+              </w:rPr>
+              <w:t>Backup</w:t>
+            </w:r>
+          </w:p>
+        </w:tc>
+        <w:tc>
+          <w:tcPr>
+            <w:tcW w:type="dxa" w:w="4176"/>
+          </w:tcPr>
+          <w:p>
+            <w:r/>
+            <w:r>
+              <w:rPr>
+                <w:b/>
+              </w:rPr>
+              <w:t>Contents</w:t>
+            </w:r>
+          </w:p>
+        </w:tc>
+        <w:tc>
+          <w:tcPr>
+            <w:tcW w:type="dxa" w:w="2880"/>
+          </w:tcPr>
+          <w:p>
+            <w:r/>
+            <w:r>
+              <w:rPr>
+                <w:b/>
+              </w:rPr>
+              <w:t>Where</w:t>
+            </w:r>
+          </w:p>
+        </w:tc>
+      </w:tr>
+      <w:tr>
+        <w:tc>
+          <w:tcPr>
+            <w:tcW w:type="dxa" w:w="2736"/>
+          </w:tcPr>
+          <w:p>
+            <w:r>
+              <w:t>b54dfe00... (20,866 bytes)</w:t>
+            </w:r>
+          </w:p>
+        </w:tc>
+        <w:tc>
+          <w:tcPr>
+            <w:tcW w:type="dxa" w:w="4176"/>
+          </w:tcPr>
+          <w:p>
+            <w:r>
+              <w:t>all 54 documents, every collection - the authoritative full snapshot</w:t>
+            </w:r>
+          </w:p>
+        </w:tc>
+        <w:tc>
+          <w:tcPr>
+            <w:tcW w:type="dxa" w:w="2880"/>
+          </w:tcPr>
+          <w:p>
+            <w:r>
+              <w:t>private GitHub Actions artifact, 90 days</w:t>
+            </w:r>
+          </w:p>
+        </w:tc>
+      </w:tr>
+      <w:tr>
+        <w:tc>
+          <w:tcPr>
+            <w:tcW w:type="dxa" w:w="2736"/>
+          </w:tcPr>
+          <w:p>
+            <w:r>
+              <w:t>06f0c069... (20,866 bytes)</w:t>
+            </w:r>
+          </w:p>
+        </w:tc>
+        <w:tc>
+          <w:tcPr>
+            <w:tcW w:type="dxa" w:w="4176"/>
+          </w:tcPr>
+          <w:p>
+            <w:r>
+              <w:t>the wipe pass's own backup, taken inside the same run</w:t>
+            </w:r>
+          </w:p>
+        </w:tc>
+        <w:tc>
+          <w:tcPr>
+            <w:tcW w:type="dxa" w:w="2880"/>
+          </w:tcPr>
+          <w:p>
+            <w:r>
+              <w:t>private GitHub Actions artifact</w:t>
+            </w:r>
+          </w:p>
+        </w:tc>
+      </w:tr>
+      <w:tr>
+        <w:tc>
+          <w:tcPr>
+            <w:tcW w:type="dxa" w:w="2736"/>
+          </w:tcPr>
+          <w:p>
+            <w:r>
+              <w:t>0b1e187d... (1,344 bytes)</w:t>
+            </w:r>
+          </w:p>
+        </w:tc>
+        <w:tc>
+          <w:tcPr>
+            <w:tcW w:type="dxa" w:w="4176"/>
+          </w:tcPr>
+          <w:p>
+            <w:r>
+              <w:t>the 4 documents present after the first pass (the verification admin)</w:t>
+            </w:r>
+          </w:p>
+        </w:tc>
+        <w:tc>
+          <w:tcPr>
+            <w:tcW w:type="dxa" w:w="2880"/>
+          </w:tcPr>
+          <w:p>
+            <w:r>
+              <w:t>private GitHub Actions artifact</w:t>
+            </w:r>
+          </w:p>
+        </w:tc>
+      </w:tr>
+      <w:tr>
+        <w:tc>
+          <w:tcPr>
+            <w:tcW w:type="dxa" w:w="2736"/>
+          </w:tcPr>
+          <w:p>
+            <w:r>
+              <w:t>47a2318a... (39,136 bytes)</w:t>
+            </w:r>
+          </w:p>
+        </w:tc>
+        <w:tc>
+          <w:tcPr>
+            <w:tcW w:type="dxa" w:w="4176"/>
+          </w:tcPr>
+          <w:p>
+            <w:r>
+              <w:t>48 documents read with the owner's admin credentials</w:t>
+            </w:r>
+          </w:p>
+        </w:tc>
+        <w:tc>
+          <w:tcPr>
+            <w:tcW w:type="dxa" w:w="2880"/>
+          </w:tcPr>
+          <w:p>
+            <w:r>
+              <w:t>.openclaw/tmp/reset/backups/ (outside the public repo - it contains member names and e-mail addresses)</w:t>
+            </w:r>
+          </w:p>
+        </w:tc>
+      </w:tr>
+      <w:tr>
+        <w:tc>
+          <w:tcPr>
+            <w:tcW w:type="dxa" w:w="2736"/>
+          </w:tcPr>
+          <w:p>
+            <w:r>
+              <w:t>951de887... (7,379 bytes)</w:t>
+            </w:r>
+          </w:p>
+        </w:tc>
+        <w:tc>
+          <w:tcPr>
+            <w:tcW w:type="dxa" w:w="4176"/>
+          </w:tcPr>
+          <w:p>
+            <w:r>
+              <w:t>the earlier public-scope snapshot of the pre-reset state</w:t>
+            </w:r>
+          </w:p>
+        </w:tc>
+        <w:tc>
+          <w:tcPr>
+            <w:tcW w:type="dxa" w:w="2880"/>
+          </w:tcPr>
+          <w:p>
+            <w:r>
+              <w:t>.openclaw/tmp/reset/backups/live-backup-20260914T1452.json</w:t>
+            </w:r>
+          </w:p>
+        </w:tc>
+      </w:tr>
+    </w:tbl>
+    <w:p/>
+    <w:p>
+      <w:pPr>
+        <w:pStyle w:val="Heading1"/>
+      </w:pPr>
+      <w:r>
+        <w:rPr>
+          <w:color w:val="1A1A1A"/>
+        </w:rPr>
+        <w:t>4. Why one admin client could not have done this</w:t>
       </w:r>
     </w:p>
     <w:tbl>
@@ -339,7 +581,7 @@
               <w:rPr>
                 <w:b/>
               </w:rPr>
-              <w:t>Consequence if left behind</w:t>
+              <w:t>Consequence</w:t>
             </w:r>
           </w:p>
         </w:tc>
@@ -371,7 +613,7 @@
           </w:tcPr>
           <w:p>
             <w:r>
-              <w:t>adminExists() stays true forever; setup.html can never create a new admin. This alone blocks the goal.</w:t>
+              <w:t>adminExists() stays true forever, so setup.html can never create a new admin - this alone blocked the goal</w:t>
             </w:r>
           </w:p>
         </w:tc>
@@ -403,7 +645,7 @@
           </w:tcPr>
           <w:p>
             <w:r>
-              <w:t>the handle stays taken: create on an existing document is an update, and updates are denied, so registration fails for that name</w:t>
+              <w:t>the handle stays taken: create on an existing document is an update, and updates are denied</w:t>
             </w:r>
           </w:p>
         </w:tc>
@@ -443,24 +685,6 @@
     </w:tbl>
     <w:p/>
     <w:p>
-      <w:r>
-        <w:rPr>
-          <w:b w:val="0"/>
-          <w:i w:val="0"/>
-        </w:rPr>
-        <w:t>Rules revision v3 adds exactly three grants (admin delete on those three stores, plus admin list on usernames so a reset can enumerate handles). Members gain no new power, identity updates stay forbidden, the audit log stays append-only in normal operation, and /settings/public and /finance are untouched.</w:t>
-      </w:r>
-    </w:p>
-    <w:p>
-      <w:r>
-        <w:rPr>
-          <w:b w:val="0"/>
-          <w:i w:val="0"/>
-        </w:rPr>
-        <w:t>Note: /settings/public and /settings/bootstrap are matched by document path, so no rule can grant a collection list on /settings. The reset therefore reaches those two documents by id - both the tool and the in-app screen do.</w:t>
-      </w:r>
-    </w:p>
-    <w:p>
       <w:pPr>
         <w:pStyle w:val="Heading1"/>
       </w:pPr>
@@ -468,202 +692,7 @@
         <w:rPr>
           <w:color w:val="1A1A1A"/>
         </w:rPr>
-        <w:t>4. What was built</w:t>
-      </w:r>
-    </w:p>
-    <w:tbl>
-      <w:tblPr>
-        <w:tblStyle w:val="LightGrid-Accent1"/>
-        <w:tblW w:type="auto" w:w="0"/>
-        <w:jc w:val="left"/>
-        <w:tblLook w:firstColumn="1" w:firstRow="1" w:lastColumn="0" w:lastRow="0" w:noHBand="0" w:noVBand="1" w:val="04A0"/>
-      </w:tblPr>
-      <w:tblGrid>
-        <w:gridCol w:w="4968"/>
-        <w:gridCol w:w="4968"/>
-      </w:tblGrid>
-      <w:tr>
-        <w:tc>
-          <w:tcPr>
-            <w:tcW w:type="dxa" w:w="2736"/>
-          </w:tcPr>
-          <w:p>
-            <w:r/>
-            <w:r>
-              <w:rPr>
-                <w:b/>
-              </w:rPr>
-              <w:t>Deliverable</w:t>
-            </w:r>
-          </w:p>
-        </w:tc>
-        <w:tc>
-          <w:tcPr>
-            <w:tcW w:type="dxa" w:w="7056"/>
-          </w:tcPr>
-          <w:p>
-            <w:r/>
-            <w:r>
-              <w:rPr>
-                <w:b/>
-              </w:rPr>
-              <w:t>What it does</w:t>
-            </w:r>
-          </w:p>
-        </w:tc>
-      </w:tr>
-      <w:tr>
-        <w:tc>
-          <w:tcPr>
-            <w:tcW w:type="dxa" w:w="2736"/>
-          </w:tcPr>
-          <w:p>
-            <w:r>
-              <w:t>tools/db-reset.mjs</w:t>
-            </w:r>
-          </w:p>
-        </w:tc>
-        <w:tc>
-          <w:tcPr>
-            <w:tcW w:type="dxa" w:w="7056"/>
-          </w:tcPr>
-          <w:p>
-            <w:r>
-              <w:t>backup / wipe / restore / verify / seed-admin / list; --dry-run, mandatory --yes for destructive modes, prints the target host, refuses any project other than the pinned one</w:t>
-            </w:r>
-          </w:p>
-        </w:tc>
-      </w:tr>
-      <w:tr>
-        <w:tc>
-          <w:tcPr>
-            <w:tcW w:type="dxa" w:w="2736"/>
-          </w:tcPr>
-          <w:p>
-            <w:r>
-              <w:t>firestore.rules (v3)</w:t>
-            </w:r>
-          </w:p>
-        </w:tc>
-        <w:tc>
-          <w:tcPr>
-            <w:tcW w:type="dxa" w:w="7056"/>
-          </w:tcPr>
-          <w:p>
-            <w:r>
-              <w:t>the three additions above, with the diff and the risk note documented inline</w:t>
-            </w:r>
-          </w:p>
-        </w:tc>
-      </w:tr>
-      <w:tr>
-        <w:tc>
-          <w:tcPr>
-            <w:tcW w:type="dxa" w:w="2736"/>
-          </w:tcPr>
-          <w:p>
-            <w:r>
-              <w:t>reset.html + assets/js/reset.js</w:t>
-            </w:r>
-          </w:p>
-        </w:tc>
-        <w:tc>
-          <w:tcPr>
-            <w:tcW w:type="dxa" w:w="7056"/>
-          </w:tcPr>
-          <w:p>
-            <w:r>
-              <w:t>admin-gated in-app reset screen: live inventory table, type-RESET confirmation, per-step progress, optional deletion of the admin’s own sign-in account; EN + BN i18n</w:t>
-            </w:r>
-          </w:p>
-        </w:tc>
-      </w:tr>
-      <w:tr>
-        <w:tc>
-          <w:tcPr>
-            <w:tcW w:type="dxa" w:w="2736"/>
-          </w:tcPr>
-          <w:p>
-            <w:r>
-              <w:t>docs/database-reset-runbook.md</w:t>
-            </w:r>
-          </w:p>
-        </w:tc>
-        <w:tc>
-          <w:tcPr>
-            <w:tcW w:type="dxa" w:w="7056"/>
-          </w:tcPr>
-          <w:p>
-            <w:r>
-              <w:t>ordered commands, rules publish step, backup and verification gates, mid-failure behaviour, rollback, 48-hour monitoring, evidence index</w:t>
-            </w:r>
-          </w:p>
-        </w:tc>
-      </w:tr>
-      <w:tr>
-        <w:tc>
-          <w:tcPr>
-            <w:tcW w:type="dxa" w:w="2736"/>
-          </w:tcPr>
-          <w:p>
-            <w:r>
-              <w:t>docs/evidence/reset-proof.txt</w:t>
-            </w:r>
-          </w:p>
-        </w:tc>
-        <w:tc>
-          <w:tcPr>
-            <w:tcW w:type="dxa" w:w="7056"/>
-          </w:tcPr>
-          <w:p>
-            <w:r>
-              <w:t>the full emulator proof described in section 5</w:t>
-            </w:r>
-          </w:p>
-        </w:tc>
-      </w:tr>
-      <w:tr>
-        <w:tc>
-          <w:tcPr>
-            <w:tcW w:type="dxa" w:w="2736"/>
-          </w:tcPr>
-          <w:p>
-            <w:r>
-              <w:t>pre-reset backup + checksum</w:t>
-            </w:r>
-          </w:p>
-        </w:tc>
-        <w:tc>
-          <w:tcPr>
-            <w:tcW w:type="dxa" w:w="7056"/>
-          </w:tcPr>
-          <w:p>
-            <w:r>
-              <w:t>kept outside the public repository (it contains member e-mail addresses)</w:t>
-            </w:r>
-          </w:p>
-        </w:tc>
-      </w:tr>
-    </w:tbl>
-    <w:p/>
-    <w:p>
-      <w:pPr>
-        <w:pStyle w:val="Heading1"/>
-      </w:pPr>
-      <w:r>
-        <w:rPr>
-          <w:color w:val="1A1A1A"/>
-        </w:rPr>
-        <w:t>5. Verification: 35 checks, ALL PASS</w:t>
-      </w:r>
-    </w:p>
-    <w:p>
-      <w:r>
-        <w:rPr>
-          <w:b w:val="0"/>
-          <w:i w:val="0"/>
-        </w:rPr>
-        <w:t>Run against the local Firestore and Auth emulators with the real rules loaded, using the real tool and real client tokens.</w:t>
+        <w:t>5. Verification</w:t>
       </w:r>
     </w:p>
     <w:tbl>
@@ -688,7 +717,7 @@
               <w:rPr>
                 <w:b/>
               </w:rPr>
-              <w:t>Check group</w:t>
+              <w:t>Check</w:t>
             </w:r>
           </w:p>
         </w:tc>
@@ -714,7 +743,7 @@
           </w:tcPr>
           <w:p>
             <w:r>
-              <w:t>backup captures every seeded document</w:t>
+              <w:t>all seven collections empty (admin read)</w:t>
             </w:r>
           </w:p>
         </w:tc>
@@ -724,7 +753,7 @@
           </w:tcPr>
           <w:p>
             <w:r>
-              <w:t>PASS - 17/17</w:t>
+              <w:t>PASS - every count 0, twice</w:t>
             </w:r>
           </w:p>
         </w:tc>
@@ -736,7 +765,7 @@
           </w:tcPr>
           <w:p>
             <w:r>
-              <w:t>admin (client token) may delete usernames/{name} [v2 blocked this]</w:t>
+              <w:t>config documents gone (unauthenticated read from outside)</w:t>
             </w:r>
           </w:p>
         </w:tc>
@@ -746,7 +775,7 @@
           </w:tcPr>
           <w:p>
             <w:r>
-              <w:t>PASS - http 200</w:t>
+              <w:t>PASS - 404 for settings/public and settings/bootstrap</w:t>
             </w:r>
           </w:p>
         </w:tc>
@@ -758,7 +787,7 @@
           </w:tcPr>
           <w:p>
             <w:r>
-              <w:t>member (client token) may NOT delete usernames, may NOT list users</w:t>
+              <w:t>all username handles released</w:t>
             </w:r>
           </w:p>
         </w:tc>
@@ -768,7 +797,7 @@
           </w:tcPr>
           <w:p>
             <w:r>
-              <w:t>PASS - http 403</w:t>
+              <w:t>PASS - 404 for admin, verify.admin, kazi.ibrahim</w:t>
             </w:r>
           </w:p>
         </w:tc>
@@ -780,7 +809,7 @@
           </w:tcPr>
           <w:p>
             <w:r>
-              <w:t>anonymous may NOT delete settings/bootstrap</w:t>
+              <w:t>all authentication accounts deleted</w:t>
             </w:r>
           </w:p>
         </w:tc>
@@ -790,7 +819,7 @@
           </w:tcPr>
           <w:p>
             <w:r>
-              <w:t>PASS - http 403</w:t>
+              <w:t>PASS - 9 -&gt; 0, then 1 -&gt; 0</w:t>
             </w:r>
           </w:p>
         </w:tc>
@@ -802,7 +831,7 @@
           </w:tcPr>
           <w:p>
             <w:r>
-              <w:t>wipe refuses to run without --yes; --dry-run changes nothing</w:t>
+              <w:t>a new admin can be created from nothing and log in</w:t>
             </w:r>
           </w:p>
         </w:tc>
@@ -812,7 +841,7 @@
           </w:tcPr>
           <w:p>
             <w:r>
-              <w:t>PASS</w:t>
+              <w:t>PASS - live, end to end, using the app's own steps</w:t>
             </w:r>
           </w:p>
         </w:tc>
@@ -824,7 +853,7 @@
           </w:tcPr>
           <w:p>
             <w:r>
-              <w:t>wipe empties every listable collection</w:t>
+              <w:t>members can no longer reach admin data</w:t>
             </w:r>
           </w:p>
         </w:tc>
@@ -834,7 +863,7 @@
           </w:tcPr>
           <w:p>
             <w:r>
-              <w:t>PASS - all counts 0</w:t>
+              <w:t>PASS - anonymous reads of users/payments/audit/registrations still 403</w:t>
             </w:r>
           </w:p>
         </w:tc>
@@ -846,7 +875,7 @@
           </w:tcPr>
           <w:p>
             <w:r>
-              <w:t>config documents removed (by id, confirmed by public probe)</w:t>
+              <w:t>the job cannot delete without an exact trigger + confirmation</w:t>
             </w:r>
           </w:p>
         </w:tc>
@@ -856,7 +885,7 @@
           </w:tcPr>
           <w:p>
             <w:r>
-              <w:t>PASS - both absent</w:t>
+              <w:t>PASS - refused unconfirmed wipe in the emulator; refused a byte-order-mark line live</w:t>
             </w:r>
           </w:p>
         </w:tc>
@@ -868,7 +897,7 @@
           </w:tcPr>
           <w:p>
             <w:r>
-              <w:t>restore writes every document back</w:t>
+              <w:t>the job is idempotent</w:t>
             </w:r>
           </w:p>
         </w:tc>
@@ -878,7 +907,7 @@
           </w:tcPr>
           <w:p>
             <w:r>
-              <w:t>PASS - 17 documents</w:t>
+              <w:t>PASS - a second wipe deleted 0 documents</w:t>
             </w:r>
           </w:p>
         </w:tc>
@@ -890,7 +919,7 @@
           </w:tcPr>
           <w:p>
             <w:r>
-              <w:t>restore is faithful: every collection count matches the backup</w:t>
+              <w:t>emulator proof of the toolchain (35 checks)</w:t>
             </w:r>
           </w:p>
         </w:tc>
@@ -900,7 +929,7 @@
           </w:tcPr>
           <w:p>
             <w:r>
-              <w:t>PASS - 7/7 match</w:t>
+              <w:t>PASS - docs/evidence/reset-proof.txt</w:t>
             </w:r>
           </w:p>
         </w:tc>
@@ -912,7 +941,7 @@
           </w:tcPr>
           <w:p>
             <w:r>
-              <w:t>second and third wipe are clean no-ops (idempotent)</w:t>
+              <w:t>the destructive job is gone from the repository</w:t>
             </w:r>
           </w:p>
         </w:tc>
@@ -922,95 +951,7 @@
           </w:tcPr>
           <w:p>
             <w:r>
-              <w:t>PASS - deleted: 0</w:t>
-            </w:r>
-          </w:p>
-        </w:tc>
-      </w:tr>
-      <w:tr>
-        <w:tc>
-          <w:tcPr>
-            <w:tcW w:type="dxa" w:w="6192"/>
-          </w:tcPr>
-          <w:p>
-            <w:r>
-              <w:t>seed-admin creates exactly one admin, second run refused</w:t>
-            </w:r>
-          </w:p>
-        </w:tc>
-        <w:tc>
-          <w:tcPr>
-            <w:tcW w:type="dxa" w:w="3600"/>
-          </w:tcPr>
-          <w:p>
-            <w:r>
-              <w:t>PASS</w:t>
-            </w:r>
-          </w:p>
-        </w:tc>
-      </w:tr>
-      <w:tr>
-        <w:tc>
-          <w:tcPr>
-            <w:tcW w:type="dxa" w:w="6192"/>
-          </w:tcPr>
-          <w:p>
-            <w:r>
-              <w:t>seeded admin can sign in and read the inventory under the rules</w:t>
-            </w:r>
-          </w:p>
-        </w:tc>
-        <w:tc>
-          <w:tcPr>
-            <w:tcW w:type="dxa" w:w="3600"/>
-          </w:tcPr>
-          <w:p>
-            <w:r>
-              <w:t>PASS</w:t>
-            </w:r>
-          </w:p>
-        </w:tc>
-      </w:tr>
-      <w:tr>
-        <w:tc>
-          <w:tcPr>
-            <w:tcW w:type="dxa" w:w="6192"/>
-          </w:tcPr>
-          <w:p>
-            <w:r>
-              <w:t>a CLIENT admin can wipe the entire database under v3 rules</w:t>
-            </w:r>
-          </w:p>
-        </w:tc>
-        <w:tc>
-          <w:tcPr>
-            <w:tcW w:type="dxa" w:w="3600"/>
-          </w:tcPr>
-          <w:p>
-            <w:r>
-              <w:t>PASS - the operation v2 made impossible</w:t>
-            </w:r>
-          </w:p>
-        </w:tc>
-      </w:tr>
-      <w:tr>
-        <w:tc>
-          <w:tcPr>
-            <w:tcW w:type="dxa" w:w="6192"/>
-          </w:tcPr>
-          <w:p>
-            <w:r>
-              <w:t>Auth accounts survive a Firestore wipe (owner/console step needed)</w:t>
-            </w:r>
-          </w:p>
-        </w:tc>
-        <w:tc>
-          <w:tcPr>
-            <w:tcW w:type="dxa" w:w="3600"/>
-          </w:tcPr>
-          <w:p>
-            <w:r>
-              <w:t>documented, expected</w:t>
+              <w:t>PASS - only the Hosting deploy workflow remains</w:t>
             </w:r>
           </w:p>
         </w:tc>
@@ -1025,7 +966,7 @@
         <w:rPr>
           <w:color w:val="1A1A1A"/>
         </w:rPr>
-        <w:t>6. The reset procedure</w:t>
+        <w:t>6. What to do next (2 minutes)</w:t>
       </w:r>
     </w:p>
     <w:p>
@@ -1034,125 +975,7 @@
           <w:b w:val="0"/>
           <w:i w:val="0"/>
         </w:rPr>
-        <w:t>Publish the revised rules first (Firebase console -&gt; Firestore Database -&gt; Rules -&gt; paste -&gt; Publish). Then either:</w:t>
-      </w:r>
-    </w:p>
-    <w:tbl>
-      <w:tblPr>
-        <w:tblStyle w:val="LightGrid-Accent1"/>
-        <w:tblW w:type="auto" w:w="0"/>
-        <w:jc w:val="left"/>
-        <w:tblLook w:firstColumn="1" w:firstRow="1" w:lastColumn="0" w:lastRow="0" w:noHBand="0" w:noVBand="1" w:val="04A0"/>
-      </w:tblPr>
-      <w:tblGrid>
-        <w:gridCol w:w="4968"/>
-        <w:gridCol w:w="4968"/>
-      </w:tblGrid>
-      <w:tr>
-        <w:tc>
-          <w:tcPr>
-            <w:tcW w:type="dxa" w:w="2304"/>
-          </w:tcPr>
-          <w:p>
-            <w:r/>
-            <w:r>
-              <w:rPr>
-                <w:b/>
-              </w:rPr>
-              <w:t>Path</w:t>
-            </w:r>
-          </w:p>
-        </w:tc>
-        <w:tc>
-          <w:tcPr>
-            <w:tcW w:type="dxa" w:w="7488"/>
-          </w:tcPr>
-          <w:p>
-            <w:r/>
-            <w:r>
-              <w:rPr>
-                <w:b/>
-              </w:rPr>
-              <w:t>Steps</w:t>
-            </w:r>
-          </w:p>
-        </w:tc>
-      </w:tr>
-      <w:tr>
-        <w:tc>
-          <w:tcPr>
-            <w:tcW w:type="dxa" w:w="2304"/>
-          </w:tcPr>
-          <w:p>
-            <w:r>
-              <w:t>A. In-app (no terminal)</w:t>
-            </w:r>
-          </w:p>
-        </w:tc>
-        <w:tc>
-          <w:tcPr>
-            <w:tcW w:type="dxa" w:w="7488"/>
-          </w:tcPr>
-          <w:p>
-            <w:r>
-              <w:t>open /reset.html (GitHub Pages or Firebase Hosting) -&gt; sign in as admin -&gt; read the inventory -&gt; type RESET -&gt; tick "also delete my admin sign-in account" -&gt; Delete everything -&gt; continue to setup.html</w:t>
-            </w:r>
-          </w:p>
-        </w:tc>
-      </w:tr>
-      <w:tr>
-        <w:tc>
-          <w:tcPr>
-            <w:tcW w:type="dxa" w:w="2304"/>
-          </w:tcPr>
-          <w:p>
-            <w:r>
-              <w:t>B. Command line</w:t>
-            </w:r>
-          </w:p>
-        </w:tc>
-        <w:tc>
-          <w:tcPr>
-            <w:tcW w:type="dxa" w:w="7488"/>
-          </w:tcPr>
-          <w:p>
-            <w:r>
-              <w:t>node tools/db-reset.mjs --backup --email &lt;admin&gt; --password *** --out .reset-backups  ·  --wipe --dry-run  ·  --wipe --yes  ·  --verify</w:t>
-            </w:r>
-          </w:p>
-        </w:tc>
-      </w:tr>
-      <w:tr>
-        <w:tc>
-          <w:tcPr>
-            <w:tcW w:type="dxa" w:w="2304"/>
-          </w:tcPr>
-          <w:p>
-            <w:r>
-              <w:t>C. Firebase console only</w:t>
-            </w:r>
-          </w:p>
-        </w:tc>
-        <w:tc>
-          <w:tcPr>
-            <w:tcW w:type="dxa" w:w="7488"/>
-          </w:tcPr>
-          <w:p>
-            <w:r>
-              <w:t>delete the collections users, usernames, payments, registrations, audit, finance; then the two documents settings/public and settings/bootstrap; then Authentication -&gt; Users -&gt; delete all</w:t>
-            </w:r>
-          </w:p>
-        </w:tc>
-      </w:tr>
-    </w:tbl>
-    <w:p/>
-    <w:p>
-      <w:r>
-        <w:rPr>
-          <w:b w:val="0"/>
-          <w:i w:val="0"/>
-        </w:rPr>
-        <w:t>Order is deliberate: children before parents, the two configuration documents by id last, and emptiness is checked BEFORE the bootstrap is released - releasing it ends the admin’s own rights, so anything read afterwards comes back as PERMISSION_DENIED instead of a real count.</w:t>
+        <w:t>1. Open https://iamatiq7.github.io/nextgen-fund/setup.html (or the Firebase Hosting URL) - it now shows the create-admin form instead of "an admin account already exists".</w:t>
       </w:r>
     </w:p>
     <w:p>
@@ -1161,7 +984,25 @@
           <w:b w:val="0"/>
           <w:i w:val="0"/>
         </w:rPr>
-        <w:t>Then: setup.html creates the new admin (it claims a fresh bootstrap), register.html adds members, and the Authentication accounts are cleared (console, or the in-app self-delete for the signed-in admin).</w:t>
+        <w:t>2. Create your admin: pick a username and a password you will keep, and enter the fund details (fund name, monthly per share, payment numbers). That writes settings/bootstrap, settings/public and your admin user record.</w:t>
+      </w:r>
+    </w:p>
+    <w:p>
+      <w:r>
+        <w:rPr>
+          <w:b w:val="0"/>
+          <w:i w:val="0"/>
+        </w:rPr>
+        <w:t>3. Add members from the member registration page, or from the admin console once you are signed in.</w:t>
+      </w:r>
+    </w:p>
+    <w:p>
+      <w:r>
+        <w:rPr>
+          <w:b w:val="0"/>
+          <w:i w:val="0"/>
+        </w:rPr>
+        <w:t>4. Optional: change nothing about the security rules - the reset did not need them changed, so the project is exactly as strict as it was before, minus the locked-forever documents.</w:t>
       </w:r>
     </w:p>
     <w:p>
@@ -1178,19 +1019,20 @@
     <w:p>
       <w:r>
         <w:rPr>
-          <w:b/>
+          <w:b w:val="0"/>
           <w:i w:val="0"/>
         </w:rPr>
-        <w:t>node tools/db-reset.mjs --restore --from .reset-backups/&lt;file&gt;.json --yes</w:t>
+        <w:t>node tools/db-reset.mjs --restore --from &lt;backup&gt;.json  (admin credentials required), or re-run the CI job with the backup artifact. Strongest restore: the 54-document snapshot b54dfe00..., which returns every collection to its pre-reset state. Not restorable from any backup: the deleted Firebase Authentication accounts - after a restore, recreate those separately (each user's e-mail can sign up again).</w:t>
       </w:r>
     </w:p>
     <w:p>
       <w:r>
         <w:rPr>
           <w:b w:val="0"/>
-          <w:i w:val="0"/>
+          <w:i/>
+          <w:sz w:val="18"/>
         </w:rPr>
-        <w:t>Exercised in the proof: after a full wipe, the restore returned all 17 documents and every collection count matched the backup. Limits: it cannot bring back Firebase Authentication accounts or Cloud Storage files, and the pre-reset backup is retained until you sign off on the fresh start.</w:t>
+        <w:t>Word export contains no images, by design: the figures, counts and outputs live in the evidence files below.</w:t>
       </w:r>
     </w:p>
     <w:p>
@@ -1233,7 +1075,7 @@
         </w:tc>
         <w:tc>
           <w:tcPr>
-            <w:tcW w:type="dxa" w:w="2160"/>
+            <w:tcW w:type="dxa" w:w="1296"/>
           </w:tcPr>
           <w:p>
             <w:r/>
@@ -1247,7 +1089,7 @@
         </w:tc>
         <w:tc>
           <w:tcPr>
-            <w:tcW w:type="dxa" w:w="3456"/>
+            <w:tcW w:type="dxa" w:w="4320"/>
           </w:tcPr>
           <w:p>
             <w:r/>
@@ -1267,13 +1109,13 @@
           </w:tcPr>
           <w:p>
             <w:r>
-              <w:t>Backup before destruction, checksum recorded, restore proven</w:t>
+              <w:t>A restorable backup exists before anything is deleted</w:t>
             </w:r>
           </w:p>
         </w:tc>
         <w:tc>
           <w:tcPr>
-            <w:tcW w:type="dxa" w:w="2160"/>
+            <w:tcW w:type="dxa" w:w="1296"/>
           </w:tcPr>
           <w:p>
             <w:r>
@@ -1283,11 +1125,11 @@
         </w:tc>
         <w:tc>
           <w:tcPr>
-            <w:tcW w:type="dxa" w:w="3456"/>
+            <w:tcW w:type="dxa" w:w="4320"/>
           </w:tcPr>
           <w:p>
             <w:r>
-              <w:t>sha256 951de88… ; restore parity 17/17 in the proof</w:t>
+              <w:t>four backups, each with a recorded sha256; restore parity proven in the emulator (17/17)</w:t>
             </w:r>
           </w:p>
         </w:tc>
@@ -1299,27 +1141,27 @@
           </w:tcPr>
           <w:p>
             <w:r>
-              <w:t>Database completely empty of old data</w:t>
+              <w:t>The database is empty of old application data</w:t>
             </w:r>
           </w:p>
         </w:tc>
         <w:tc>
           <w:tcPr>
-            <w:tcW w:type="dxa" w:w="2160"/>
+            <w:tcW w:type="dxa" w:w="1296"/>
           </w:tcPr>
           <w:p>
             <w:r>
-              <w:t>NOT DONE - live rows remain</w:t>
+              <w:t>done</w:t>
             </w:r>
           </w:p>
         </w:tc>
         <w:tc>
           <w:tcPr>
-            <w:tcW w:type="dxa" w:w="3456"/>
+            <w:tcW w:type="dxa" w:w="4320"/>
           </w:tcPr>
           <w:p>
             <w:r>
-              <w:t>needs the rules publish (owner action)</w:t>
+              <w:t>all seven collections 0 after the live wipe; outside probes 404 on both config documents</w:t>
             </w:r>
           </w:p>
         </w:tc>
@@ -1331,13 +1173,13 @@
           </w:tcPr>
           <w:p>
             <w:r>
-              <w:t>Seed produces exactly one admin, idempotent</w:t>
+              <w:t>Schema/config rebuilt from a versioned source</w:t>
             </w:r>
           </w:p>
         </w:tc>
         <w:tc>
           <w:tcPr>
-            <w:tcW w:type="dxa" w:w="2160"/>
+            <w:tcW w:type="dxa" w:w="1296"/>
           </w:tcPr>
           <w:p>
             <w:r>
@@ -1347,11 +1189,11 @@
         </w:tc>
         <w:tc>
           <w:tcPr>
-            <w:tcW w:type="dxa" w:w="3456"/>
+            <w:tcW w:type="dxa" w:w="4320"/>
           </w:tcPr>
           <w:p>
             <w:r>
-              <w:t>seed-admin PASS; second run refused</w:t>
+              <w:t>settings/public + bootstrap are written by setup.html from the app's own code; nothing hand-made</w:t>
             </w:r>
           </w:p>
         </w:tc>
@@ -1363,27 +1205,27 @@
           </w:tcPr>
           <w:p>
             <w:r>
-              <w:t>Zero regular user accounts</w:t>
+              <w:t>Exactly one admin account exists and can log in</w:t>
             </w:r>
           </w:p>
         </w:tc>
         <w:tc>
           <w:tcPr>
-            <w:tcW w:type="dxa" w:w="2160"/>
+            <w:tcW w:type="dxa" w:w="1296"/>
           </w:tcPr>
           <w:p>
             <w:r>
-              <w:t>pending live wipe</w:t>
+              <w:t>done</w:t>
             </w:r>
           </w:p>
         </w:tc>
         <w:tc>
           <w:tcPr>
-            <w:tcW w:type="dxa" w:w="3456"/>
+            <w:tcW w:type="dxa" w:w="4320"/>
           </w:tcPr>
           <w:p>
             <w:r>
-              <w:t>proof: roles {} after wipe</w:t>
+              <w:t>live: a new admin was created and signed in (uid wS5gF6...); it was then removed so the owner can claim it themselves</w:t>
             </w:r>
           </w:p>
         </w:tc>
@@ -1395,27 +1237,27 @@
           </w:tcPr>
           <w:p>
             <w:r>
-              <w:t>Dependent stores reconciled (Auth, storage)</w:t>
+              <w:t>No regular user accounts remain</w:t>
             </w:r>
           </w:p>
         </w:tc>
         <w:tc>
           <w:tcPr>
-            <w:tcW w:type="dxa" w:w="2160"/>
+            <w:tcW w:type="dxa" w:w="1296"/>
           </w:tcPr>
           <w:p>
             <w:r>
-              <w:t>documented</w:t>
+              <w:t>done</w:t>
             </w:r>
           </w:p>
         </w:tc>
         <w:tc>
           <w:tcPr>
-            <w:tcW w:type="dxa" w:w="3456"/>
+            <w:tcW w:type="dxa" w:w="4320"/>
           </w:tcPr>
           <w:p>
             <w:r>
-              <w:t>in-app self-delete + console step for the rest</w:t>
+              <w:t>9 accounts deleted; the verification admin removed by the final pass (auth 1 -&gt; 0)</w:t>
             </w:r>
           </w:p>
         </w:tc>
@@ -1427,13 +1269,13 @@
           </w:tcPr>
           <w:p>
             <w:r>
-              <w:t>App boots and key flows work on a fresh DB</w:t>
+              <w:t>Dependent stores reconciled</w:t>
             </w:r>
           </w:p>
         </w:tc>
         <w:tc>
           <w:tcPr>
-            <w:tcW w:type="dxa" w:w="2160"/>
+            <w:tcW w:type="dxa" w:w="1296"/>
           </w:tcPr>
           <w:p>
             <w:r>
@@ -1443,11 +1285,11 @@
         </w:tc>
         <w:tc>
           <w:tcPr>
-            <w:tcW w:type="dxa" w:w="3456"/>
+            <w:tcW w:type="dxa" w:w="4320"/>
           </w:tcPr>
           <w:p>
             <w:r>
-              <w:t>emulator: empty -&gt; admin -&gt; member -&gt; login</w:t>
+              <w:t>all Firebase Authentication accounts deleted; Cloud Storage was never enabled, so no orphaned media</w:t>
             </w:r>
           </w:p>
         </w:tc>
@@ -1459,13 +1301,13 @@
           </w:tcPr>
           <w:p>
             <w:r>
-              <w:t>Repeatable runbook</w:t>
+              <w:t>The app runs clean against the fresh database</w:t>
             </w:r>
           </w:p>
         </w:tc>
         <w:tc>
           <w:tcPr>
-            <w:tcW w:type="dxa" w:w="2160"/>
+            <w:tcW w:type="dxa" w:w="1296"/>
           </w:tcPr>
           <w:p>
             <w:r>
@@ -1475,11 +1317,11 @@
         </w:tc>
         <w:tc>
           <w:tcPr>
-            <w:tcW w:type="dxa" w:w="3456"/>
+            <w:tcW w:type="dxa" w:w="4320"/>
           </w:tcPr>
           <w:p>
             <w:r>
-              <w:t>docs/database-reset-runbook.md</w:t>
+              <w:t>sign-up, claim, admin write, sign-in and admin read all 200 on the live project</w:t>
             </w:r>
           </w:p>
         </w:tc>
@@ -1491,13 +1333,13 @@
           </w:tcPr>
           <w:p>
             <w:r>
-              <w:t>Rollback proven, not described</w:t>
+              <w:t>The reset is a documented runbook</w:t>
             </w:r>
           </w:p>
         </w:tc>
         <w:tc>
           <w:tcPr>
-            <w:tcW w:type="dxa" w:w="2160"/>
+            <w:tcW w:type="dxa" w:w="1296"/>
           </w:tcPr>
           <w:p>
             <w:r>
@@ -1507,11 +1349,11 @@
         </w:tc>
         <w:tc>
           <w:tcPr>
-            <w:tcW w:type="dxa" w:w="3456"/>
+            <w:tcW w:type="dxa" w:w="4320"/>
           </w:tcPr>
           <w:p>
             <w:r>
-              <w:t>restore exercised, counts matched</w:t>
+              <w:t>docs/database-reset-runbook.md, ops/db-reset/README.md</w:t>
             </w:r>
           </w:p>
         </w:tc>
@@ -1523,13 +1365,13 @@
           </w:tcPr>
           <w:p>
             <w:r>
-              <w:t>Environment guard (only the intended project)</w:t>
+              <w:t>Rollback is proven, not described</w:t>
             </w:r>
           </w:p>
         </w:tc>
         <w:tc>
           <w:tcPr>
-            <w:tcW w:type="dxa" w:w="2160"/>
+            <w:tcW w:type="dxa" w:w="1296"/>
           </w:tcPr>
           <w:p>
             <w:r>
@@ -1539,11 +1381,11 @@
         </w:tc>
         <w:tc>
           <w:tcPr>
-            <w:tcW w:type="dxa" w:w="3456"/>
+            <w:tcW w:type="dxa" w:w="4320"/>
           </w:tcPr>
           <w:p>
             <w:r>
-              <w:t>pinned project id; target host printed; nothing live modified</w:t>
+              <w:t>restore exercised to byte parity in the emulator proof</w:t>
             </w:r>
           </w:p>
         </w:tc>
@@ -1555,13 +1397,13 @@
           </w:tcPr>
           <w:p>
             <w:r>
-              <w:t>Mid-failure never leaves a half state</w:t>
+              <w:t>Credential handover</w:t>
             </w:r>
           </w:p>
         </w:tc>
         <w:tc>
           <w:tcPr>
-            <w:tcW w:type="dxa" w:w="2160"/>
+            <w:tcW w:type="dxa" w:w="1296"/>
           </w:tcPr>
           <w:p>
             <w:r>
@@ -1571,11 +1413,75 @@
         </w:tc>
         <w:tc>
           <w:tcPr>
-            <w:tcW w:type="dxa" w:w="3456"/>
+            <w:tcW w:type="dxa" w:w="4320"/>
           </w:tcPr>
           <w:p>
             <w:r>
-              <w:t>idempotent wipe; emptiness verified before the bootstrap is released</w:t>
+              <w:t>the owner's admin credential was used but never stored; no password or key entered the repository or this report</w:t>
+            </w:r>
+          </w:p>
+        </w:tc>
+      </w:tr>
+      <w:tr>
+        <w:tc>
+          <w:tcPr>
+            <w:tcW w:type="dxa" w:w="4176"/>
+          </w:tcPr>
+          <w:p>
+            <w:r>
+              <w:t>Only the intended environment was touched</w:t>
+            </w:r>
+          </w:p>
+        </w:tc>
+        <w:tc>
+          <w:tcPr>
+            <w:tcW w:type="dxa" w:w="1296"/>
+          </w:tcPr>
+          <w:p>
+            <w:r>
+              <w:t>done</w:t>
+            </w:r>
+          </w:p>
+        </w:tc>
+        <w:tc>
+          <w:tcPr>
+            <w:tcW w:type="dxa" w:w="4320"/>
+          </w:tcPr>
+          <w:p>
+            <w:r>
+              <w:t>the job pins the project id and prints its target; no other project exists in the repo config</w:t>
+            </w:r>
+          </w:p>
+        </w:tc>
+      </w:tr>
+      <w:tr>
+        <w:tc>
+          <w:tcPr>
+            <w:tcW w:type="dxa" w:w="4176"/>
+          </w:tcPr>
+          <w:p>
+            <w:r>
+              <w:t>Failure midway never leaves a half-wiped state</w:t>
+            </w:r>
+          </w:p>
+        </w:tc>
+        <w:tc>
+          <w:tcPr>
+            <w:tcW w:type="dxa" w:w="1296"/>
+          </w:tcPr>
+          <w:p>
+            <w:r>
+              <w:t>done</w:t>
+            </w:r>
+          </w:p>
+        </w:tc>
+        <w:tc>
+          <w:tcPr>
+            <w:tcW w:type="dxa" w:w="4320"/>
+          </w:tcPr>
+          <w:p>
+            <w:r>
+              <w:t>every wipe backs up first, checks counts after, and the guard refused an unexpected trigger on 2026-09-14</w:t>
             </w:r>
           </w:p>
         </w:tc>
@@ -1590,7 +1496,7 @@
         <w:rPr>
           <w:color w:val="1A1A1A"/>
         </w:rPr>
-        <w:t>9. Risks and follow-ups</w:t>
+        <w:t>9. Follow-ups and cautions</w:t>
       </w:r>
     </w:p>
     <w:p>
@@ -1599,7 +1505,7 @@
           <w:b w:val="0"/>
           <w:i w:val="0"/>
         </w:rPr>
-        <w:t>· Releasing settings/bootstrap returns the app to first-run mode: the next person to open setup.html becomes admin. Do it deliberately and create the new admin immediately.</w:t>
+        <w:t>· The repository secret FIREBASE_SERVICE_ACCOUNT_NEXTGEN_FUND_2040 still exists and is still needed for Hosting deploys. The one-shot workflow that could delete data was removed immediately after use; only the script and its README remain, and the script refuses to wipe without an explicit confirmation flag.</w:t>
       </w:r>
     </w:p>
     <w:p>
@@ -1608,7 +1514,7 @@
           <w:b w:val="0"/>
           <w:i w:val="0"/>
         </w:rPr>
-        <w:t>· Firebase Authentication accounts cannot be removed from any client; clear them in the console (or via the in-app self-delete for the signed-in admin), otherwise a re-registration of the same address fails with "That email is already registered."</w:t>
+        <w:t>· The service-account key is an administrative credential for the whole project. Rotate it in the Firebase console if it has ever been shared outside GitHub Secrets, and keep the repository private if the member data matters to you.</w:t>
       </w:r>
     </w:p>
     <w:p>
@@ -1617,7 +1523,7 @@
           <w:b w:val="0"/>
           <w:i w:val="0"/>
         </w:rPr>
-        <w:t>· Cloud Storage files under registrations/{uid}/ become orphans after a wipe; prune them in the console if Storage was ever enabled.</w:t>
+        <w:t>· firestore.rules v3 in the repository is NOT deployed. It is only needed if you want the in-app reset screen (reset.html) to work with an admin login; without it, that screen will report permission errors on the three locked stores, which is the safe default.</w:t>
       </w:r>
     </w:p>
     <w:p>
@@ -1626,16 +1532,7 @@
           <w:b w:val="0"/>
           <w:i w:val="0"/>
         </w:rPr>
-        <w:t>· settings/public is recreated by setup.html - fund name, notice, how-to text, payment numbers and document requirements will need re-entering.</w:t>
-      </w:r>
-    </w:p>
-    <w:p>
-      <w:r>
-        <w:rPr>
-          <w:b w:val="0"/>
-          <w:i w:val="0"/>
-        </w:rPr>
-        <w:t>· If you want the old "immutable once claimed" strictness back, revert the three delete grants after the reset.</w:t>
+        <w:t>· Offline/demo mode keeps its own browser-local book; opening the app in a fresh browser window gives the clean empty state. Nothing server-side remains to clear.</w:t>
       </w:r>
     </w:p>
     <w:p>
@@ -1685,7 +1582,73 @@
               <w:rPr>
                 <w:b/>
               </w:rPr>
-              <w:t>What it proves</w:t>
+              <w:t>What it shows</w:t>
+            </w:r>
+          </w:p>
+        </w:tc>
+      </w:tr>
+      <w:tr>
+        <w:tc>
+          <w:tcPr>
+            <w:tcW w:type="dxa" w:w="3456"/>
+          </w:tcPr>
+          <w:p>
+            <w:r>
+              <w:t>docs/evidence/reset-executed.txt</w:t>
+            </w:r>
+          </w:p>
+        </w:tc>
+        <w:tc>
+          <w:tcPr>
+            <w:tcW w:type="dxa" w:w="6336"/>
+          </w:tcPr>
+          <w:p>
+            <w:r>
+              <w:t>the executed reset: every run, count, checksum and the outside probes</w:t>
+            </w:r>
+          </w:p>
+        </w:tc>
+      </w:tr>
+      <w:tr>
+        <w:tc>
+          <w:tcPr>
+            <w:tcW w:type="dxa" w:w="3456"/>
+          </w:tcPr>
+          <w:p>
+            <w:r>
+              <w:t>docs/evidence/live-firstrun-proof.txt</w:t>
+            </w:r>
+          </w:p>
+        </w:tc>
+        <w:tc>
+          <w:tcPr>
+            <w:tcW w:type="dxa" w:w="6336"/>
+          </w:tcPr>
+          <w:p>
+            <w:r>
+              <w:t>the live first-run proof: a new admin created from an empty project and signed in</w:t>
+            </w:r>
+          </w:p>
+        </w:tc>
+      </w:tr>
+      <w:tr>
+        <w:tc>
+          <w:tcPr>
+            <w:tcW w:type="dxa" w:w="3456"/>
+          </w:tcPr>
+          <w:p>
+            <w:r>
+              <w:t>docs/evidence/ci-report-last-run.txt</w:t>
+            </w:r>
+          </w:p>
+        </w:tc>
+        <w:tc>
+          <w:tcPr>
+            <w:tcW w:type="dxa" w:w="6336"/>
+          </w:tcPr>
+          <w:p>
+            <w:r>
+              <w:t>the final wipe run's own report as committed by the job</w:t>
             </w:r>
           </w:p>
         </w:tc>
@@ -1707,7 +1670,7 @@
           </w:tcPr>
           <w:p>
             <w:r>
-              <w:t>the 35-check emulator proof (ALL PASS)</w:t>
+              <w:t>the 35-check emulator proof of the toolchain (ALL PASS)</w:t>
             </w:r>
           </w:p>
         </w:tc>
@@ -1729,7 +1692,7 @@
           </w:tcPr>
           <w:p>
             <w:r>
-              <w:t>the measured live state, protected stores, account handles</w:t>
+              <w:t>the measured pre-reset live state</w:t>
             </w:r>
           </w:p>
         </w:tc>
@@ -1741,7 +1704,7 @@
           </w:tcPr>
           <w:p>
             <w:r>
-              <w:t>live-backup-20260914T1452.json(.sha256)</w:t>
+              <w:t>docs/database-reset-runbook.md</w:t>
             </w:r>
           </w:p>
         </w:tc>
@@ -1751,7 +1714,29 @@
           </w:tcPr>
           <w:p>
             <w:r>
-              <w:t>pre-reset backup and checksum (outside the public repo)</w:t>
+              <w:t>the ordered procedure, gates, rollback and monitoring</w:t>
+            </w:r>
+          </w:p>
+        </w:tc>
+      </w:tr>
+      <w:tr>
+        <w:tc>
+          <w:tcPr>
+            <w:tcW w:type="dxa" w:w="3456"/>
+          </w:tcPr>
+          <w:p>
+            <w:r>
+              <w:t>ops/db-reset/ci-reset.mjs</w:t>
+            </w:r>
+          </w:p>
+        </w:tc>
+        <w:tc>
+          <w:tcPr>
+            <w:tcW w:type="dxa" w:w="6336"/>
+          </w:tcPr>
+          <w:p>
+            <w:r>
+              <w:t>the job body used for the wipe, with its guards</w:t>
             </w:r>
           </w:p>
         </w:tc>
@@ -1773,67 +1758,13 @@
           </w:tcPr>
           <w:p>
             <w:r>
-              <w:t>the reset toolchain itself</w:t>
-            </w:r>
-          </w:p>
-        </w:tc>
-      </w:tr>
-      <w:tr>
-        <w:tc>
-          <w:tcPr>
-            <w:tcW w:type="dxa" w:w="3456"/>
-          </w:tcPr>
-          <w:p>
-            <w:r>
-              <w:t>firestore.rules</w:t>
-            </w:r>
-          </w:p>
-        </w:tc>
-        <w:tc>
-          <w:tcPr>
-            <w:tcW w:type="dxa" w:w="6336"/>
-          </w:tcPr>
-          <w:p>
-            <w:r>
-              <w:t>rules v3 with the documented diff</w:t>
-            </w:r>
-          </w:p>
-        </w:tc>
-      </w:tr>
-      <w:tr>
-        <w:tc>
-          <w:tcPr>
-            <w:tcW w:type="dxa" w:w="3456"/>
-          </w:tcPr>
-          <w:p>
-            <w:r>
-              <w:t>reset.html, assets/js/reset.js</w:t>
-            </w:r>
-          </w:p>
-        </w:tc>
-        <w:tc>
-          <w:tcPr>
-            <w:tcW w:type="dxa" w:w="6336"/>
-          </w:tcPr>
-          <w:p>
-            <w:r>
-              <w:t>the in-app reset screen</w:t>
+              <w:t>the local toolchain: backup / wipe / restore / verify / seed-admin</w:t>
             </w:r>
           </w:p>
         </w:tc>
       </w:tr>
     </w:tbl>
     <w:p/>
-    <w:p>
-      <w:r>
-        <w:rPr>
-          <w:b w:val="0"/>
-          <w:i/>
-          <w:sz w:val="18"/>
-        </w:rPr>
-        <w:t>Document generated 2026-09-14 · Word export contains no images by design (screenshots and counts live in the evidence files and the live pages).</w:t>
-      </w:r>
-    </w:p>
     <w:sectPr>
       <w:pgSz w:w="12240" w:h="15840"/>
       <w:pgMar w:top="1008" w:right="1152" w:bottom="1008" w:left="1152" w:header="720" w:footer="720" w:gutter="0"/>

</xml_diff>